<commit_message>
docs: render-check assignment report formatting
</commit_message>
<xml_diff>
--- a/docs/面向雅思备考的个人语言知识管理系统大作业报告.docx
+++ b/docs/面向雅思备考的个人语言知识管理系统大作业报告.docx
@@ -317,8 +317,8 @@
     </w:p>
     <w:p>
       <w:pPr>
-        <w:pStyle w:val="Heading1"/>
         <w:spacing w:before="0" w:after="220" w:line="360" w:lineRule="auto"/>
+        <w:jc w:val="center"/>
       </w:pPr>
       <w:r>
         <w:rPr>
@@ -327,7 +327,7 @@
           <w:color w:val="000000"/>
           <w:sz w:val="30"/>
         </w:rPr>
-        <w:t>摘 要</w:t>
+        <w:t>摘     要</w:t>
       </w:r>
     </w:p>
     <w:p>
@@ -366,8 +366,8 @@
     </w:p>
     <w:p>
       <w:pPr>
-        <w:pStyle w:val="Heading1"/>
         <w:spacing w:before="0" w:after="220" w:line="360" w:lineRule="auto"/>
+        <w:jc w:val="center"/>
       </w:pPr>
       <w:r>
         <w:rPr>
@@ -376,7 +376,7 @@
           <w:color w:val="000000"/>
           <w:sz w:val="30"/>
         </w:rPr>
-        <w:t>目 录</w:t>
+        <w:t>目     录</w:t>
       </w:r>
     </w:p>
     <w:p>
@@ -6941,8 +6941,8 @@
     </w:p>
     <w:p>
       <w:pPr>
-        <w:pStyle w:val="Heading1"/>
         <w:spacing w:before="0" w:after="220" w:line="360" w:lineRule="auto"/>
+        <w:jc w:val="center"/>
       </w:pPr>
       <w:r>
         <w:rPr>

</xml_diff>